<commit_message>
Paper III, Poinsot geometry, GW predictions, repo cleanup
- Paper III: From Poinsot Geometry to Gravitational Waves
  - Single-cone framework (two hemispheres, not two cones)
  - I1/I3 = 7/6 (60°), 5/2 (45°), 13/2 (30°) EXACT
  - Braking → torsion → gravity, BE symmetry breaking
  - r = 1/169 tensor-to-scalar ratio (epoch-dependent)
  - GW250114 retrodict: Q = 13/4 (99.4%), spin = cos(45) (97.6%)
  - 9 predictions (#40-48), 6 problems resolved (#34-39)
- Codes 07-17: Part III computations (Poinsot, BH, GW, CMB, BE)
- Equation Page: 4 new results, improved contrast
- README, DOCUMENTATION_INDEX: updated for Part III
- Author name moved to end of all documents
- CMB modulation visualization (HTML)
- All docx/pdf regenerated from corrected md files

Filed: March 22, 2026. Prior art for LIGO IR1 (Sept 2026).

Co-Authored-By: Claude Opus 4.6 (1M context) <noreply@anthropic.com>
</commit_message>
<xml_diff>
--- a/paper/PAPER.docx
+++ b/paper/PAPER.docx
@@ -23,18 +23,6 @@
     <w:p>
       <w:pPr>
         <w:pStyle w:val="FirstParagraph"/>
-      </w:pPr>
-      <w:r>
-        <w:rPr>
-          <w:b/>
-          <w:bCs/>
-        </w:rPr>
-        <w:t xml:space="preserve">Szőke Barna</w:t>
-      </w:r>
-    </w:p>
-    <w:p>
-      <w:pPr>
-        <w:pStyle w:val="BodyText"/>
       </w:pPr>
       <w:r>
         <w:t xml:space="preserve">March 2026</w:t>
@@ -4123,7 +4111,25 @@
         <w:pStyle w:val="FirstParagraph"/>
       </w:pPr>
       <w:r>
-        <w:t xml:space="preserve">Copyright 2026 Szőke Barna. All rights reserved.</w:t>
+        <w:t xml:space="preserve">Copyright 2026. All rights reserved.</w:t>
+      </w:r>
+    </w:p>
+    <w:p>
+      <w:pPr>
+        <w:pStyle w:val="BodyText"/>
+      </w:pPr>
+      <w:r>
+        <w:rPr>
+          <w:b/>
+          <w:bCs/>
+        </w:rPr>
+        <w:t xml:space="preserve">Author:</w:t>
+      </w:r>
+      <w:r>
+        <w:t xml:space="preserve"> </w:t>
+      </w:r>
+      <w:r>
+        <w:t xml:space="preserve">Szőke Barna</w:t>
       </w:r>
     </w:p>
     <w:bookmarkEnd w:id="56"/>

</xml_diff>